<commit_message>
docs(testes): bateria real das 11h — iFood fora do ar (INTERNAL até no listAddresses); bug 40 fechado; feedback do MCP
Responsável: Thales

Co-Authored-By: Claude Opus 5.5 <noreply@anthropic.com>
Claude-Session: https://claude.ai/code/session_01MBGaQ77oFZgHoMXpY6GXwq
</commit_message>
<xml_diff>
--- a/entregaveis/Match-Entregaveis.docx
+++ b/entregaveis/Match-Entregaveis.docx
@@ -23924,6 +23924,137 @@
             </w:r>
             <w:r>
               <w:t xml:space="preserve">o benefício de itens e o de entrega, ou não somar o frete já zerado</w:t>
+            </w:r>
+          </w:p>
+        </w:tc>
+      </w:tr>
+      <w:tr>
+        <w:tc>
+          <w:tcPr/>
+          <w:p>
+            <w:pPr>
+              <w:pStyle w:val="Compact"/>
+              <w:jc w:val="left"/>
+            </w:pPr>
+            <w:r>
+              <w:t xml:space="preserve">18/10 11h05–11h08</w:t>
+            </w:r>
+          </w:p>
+        </w:tc>
+        <w:tc>
+          <w:tcPr/>
+          <w:p>
+            <w:pPr>
+              <w:pStyle w:val="Compact"/>
+              <w:jc w:val="left"/>
+            </w:pPr>
+            <w:r>
+              <w:t xml:space="preserve">Bateria real (19 casos, envio desligado) perto do fim do evento</w:t>
+            </w:r>
+          </w:p>
+        </w:tc>
+        <w:tc>
+          <w:tcPr/>
+          <w:p>
+            <w:pPr>
+              <w:pStyle w:val="Compact"/>
+              <w:jc w:val="left"/>
+            </w:pPr>
+            <w:r>
+              <w:t xml:space="preserve">Na 1ª rodada, 15/19 casos com</w:t>
+            </w:r>
+            <w:r>
+              <w:t xml:space="preserve"> </w:t>
+            </w:r>
+            <w:r>
+              <w:rPr>
+                <w:rStyle w:val="VerbatimChar"/>
+              </w:rPr>
+              <w:t xml:space="preserve">INTERNAL</w:t>
+            </w:r>
+            <w:r>
+              <w:t xml:space="preserve">; 3 min depois, 18/19: até</w:t>
+            </w:r>
+            <w:r>
+              <w:t xml:space="preserve"> </w:t>
+            </w:r>
+            <w:r>
+              <w:rPr>
+                <w:rStyle w:val="VerbatimChar"/>
+              </w:rPr>
+              <w:t xml:space="preserve">listAddresses</w:t>
+            </w:r>
+            <w:r>
+              <w:t xml:space="preserve"> </w:t>
+            </w:r>
+            <w:r>
+              <w:t xml:space="preserve">volta</w:t>
+            </w:r>
+            <w:r>
+              <w:t xml:space="preserve"> </w:t>
+            </w:r>
+            <w:r>
+              <w:rPr>
+                <w:rStyle w:val="VerbatimChar"/>
+              </w:rPr>
+              <w:t xml:space="preserve">INTERNAL</w:t>
+            </w:r>
+            <w:r>
+              <w:t xml:space="preserve"> </w:t>
+            </w:r>
+            <w:r>
+              <w:t xml:space="preserve">("An internal failure at an upstream service…",</w:t>
+            </w:r>
+            <w:r>
+              <w:t xml:space="preserve"> </w:t>
+            </w:r>
+            <w:r>
+              <w:rPr>
+                <w:rStyle w:val="VerbatimChar"/>
+              </w:rPr>
+              <w:t xml:space="preserve">agent_instruction</w:t>
+            </w:r>
+            <w:r>
+              <w:t xml:space="preserve">: "Do not retry immediately") com o login válido</w:t>
+            </w:r>
+          </w:p>
+        </w:tc>
+        <w:tc>
+          <w:tcPr/>
+          <w:p>
+            <w:pPr>
+              <w:pStyle w:val="Compact"/>
+              <w:jc w:val="left"/>
+            </w:pPr>
+            <w:r>
+              <w:t xml:space="preserve">Sem o MCP não há busca nem carrinho; o app mostra "o iFood está instável agora" e não inventa nada, mas a demo ao vivo depende de sorte</w:t>
+            </w:r>
+          </w:p>
+        </w:tc>
+        <w:tc>
+          <w:tcPr/>
+          <w:p>
+            <w:pPr>
+              <w:pStyle w:val="Compact"/>
+              <w:jc w:val="left"/>
+            </w:pPr>
+            <w:r>
+              <w:t xml:space="preserve">Página de status do MCP e um</w:t>
+            </w:r>
+            <w:r>
+              <w:t xml:space="preserve"> </w:t>
+            </w:r>
+            <w:r>
+              <w:rPr>
+                <w:rStyle w:val="VerbatimChar"/>
+              </w:rPr>
+              <w:t xml:space="preserve">retry_after</w:t>
+            </w:r>
+            <w:r>
+              <w:t xml:space="preserve"> </w:t>
+            </w:r>
+            <w:r>
+              <w:t xml:space="preserve">no erro, para o agente saber quanto esperar</w:t>
             </w:r>
           </w:p>
         </w:tc>

</xml_diff>

<commit_message>
docs(entregaveis): revisão final — Patrocinado desligado na demo, Top 4, "Fazer um match", 30 s não medido, Whopper 39,99
Responsável: Thales

Co-Authored-By: Claude Opus 5.5 <noreply@anthropic.com>
Claude-Session: https://claude.ai/code/session_01MBGaQ77oFZgHoMXpY6GXwq
</commit_message>
<xml_diff>
--- a/entregaveis/Match-Entregaveis.docx
+++ b/entregaveis/Match-Entregaveis.docx
@@ -2313,13 +2313,22 @@
         <w:t xml:space="preserve"> </w:t>
       </w:r>
       <w:r>
-        <w:t xml:space="preserve">muda nota, filtro ou escolha do Match e não garante vaga entre as lojas consultadas. Na</w:t>
-      </w:r>
-      <w:r>
-        <w:t xml:space="preserve"> </w:t>
-      </w:r>
-      <w:r>
-        <w:t xml:space="preserve">demo, a patrocinada fala primeiro e</w:t>
+        <w:t xml:space="preserve">muda nota, filtro ou escolha do Match e não garante vaga entre as lojas consultadas. O</w:t>
+      </w:r>
+      <w:r>
+        <w:t xml:space="preserve"> </w:t>
+      </w:r>
+      <w:r>
+        <w:t xml:space="preserve">mecanismo existe e é testado (</w:t>
+      </w:r>
+      <w:r>
+        <w:rPr>
+          <w:rStyle w:val="VerbatimChar"/>
+        </w:rPr>
+        <w:t xml:space="preserve">test_leilao.py</w:t>
+      </w:r>
+      <w:r>
+        <w:t xml:space="preserve">); na demo de hoje está</w:t>
       </w:r>
       <w:r>
         <w:t xml:space="preserve"> </w:t>
@@ -2329,10 +2338,16 @@
           <w:bCs/>
           <w:b/>
         </w:rPr>
-        <w:t xml:space="preserve">perde</w:t>
-      </w:r>
-      <w:r>
-        <w:t xml:space="preserve">.</w:t>
+        <w:t xml:space="preserve">desligado</w:t>
+      </w:r>
+      <w:r>
+        <w:t xml:space="preserve">: a patrocinada falaria primeiro</w:t>
+      </w:r>
+      <w:r>
+        <w:t xml:space="preserve"> </w:t>
+      </w:r>
+      <w:r>
+        <w:t xml:space="preserve">e não ganharia por isso.</w:t>
       </w:r>
     </w:p>
     <w:p>
@@ -2961,7 +2976,7 @@
               <w:jc w:val="left"/>
             </w:pPr>
             <w:r>
-              <w:t xml:space="preserve">% de grupos que dão match no 1º cartão</w:t>
+              <w:t xml:space="preserve">% de grupos que confirmam sem usar o "Ajustar"</w:t>
             </w:r>
           </w:p>
         </w:tc>
@@ -3032,7 +3047,7 @@
         <w:pStyle w:val="Compact"/>
       </w:pPr>
       <w:r>
-        <w:t xml:space="preserve">Grupo A: entrada "Pedir em grupo? Dê um Match" na home. Grupo B: app como hoje.</w:t>
+        <w:t xml:space="preserve">Grupo A: banner "Fazer um match" na home. Grupo B: app como hoje.</w:t>
       </w:r>
     </w:p>
     <w:p>
@@ -3964,7 +3979,7 @@
         <w:pStyle w:val="BlockText"/>
       </w:pPr>
       <w:r>
-        <w:t xml:space="preserve">Entregáveis 2 (desenho de solução) e 5 (documentação técnica) do Hackathon SEMCOMP 29 × iFood.</w:t>
+        <w:t xml:space="preserve">Entregáveis 2 (desenho de solução) e 5 (documentação técnica) do Hackathon SEMCOMP × iFood 2026.</w:t>
       </w:r>
       <w:r>
         <w:t xml:space="preserve"> </w:t>
@@ -7364,7 +7379,7 @@
         <w:t xml:space="preserve"> </w:t>
       </w:r>
       <w:r>
-        <w:t xml:space="preserve">O Match é uma entrada na home ("Pedir em grupo? Dê um Match"), não um app novo.</w:t>
+        <w:t xml:space="preserve">O Match é uma entrada na home (banner "Fazer um match"), não um app novo.</w:t>
       </w:r>
       <w:r>
         <w:t xml:space="preserve"> </w:t>
@@ -7681,7 +7696,7 @@
               <w:jc w:val="left"/>
             </w:pPr>
             <w:r>
-              <w:t xml:space="preserve">Home → banner "Dê um Match"</w:t>
+              <w:t xml:space="preserve">Home → banner "Fazer um match"</w:t>
             </w:r>
           </w:p>
         </w:tc>
@@ -9109,7 +9124,7 @@
         <w:t xml:space="preserve"> </w:t>
       </w:r>
       <w:r>
-        <w:t xml:space="preserve">"Ajustar com o Match" fica logo abaixo ("troca o sorvete do Milan por açaí"): o Match roda de</w:t>
+        <w:t xml:space="preserve">"Ajustar com o Match" fica logo abaixo ("troca o sorvete de Bruno por açaí"): o Match roda de</w:t>
       </w:r>
       <w:r>
         <w:t xml:space="preserve"> </w:t>
@@ -19309,7 +19324,7 @@
         <w:t xml:space="preserve"> </w:t>
       </w:r>
       <w:r>
-        <w:t xml:space="preserve">Whopper por R$ 4,90 na busca e R$ 40,99 no</w:t>
+        <w:t xml:space="preserve">Whopper por R$ 4,90 na busca e R$ 39,99 no</w:t>
       </w:r>
       <w:r>
         <w:t xml:space="preserve"> </w:t>
@@ -20017,13 +20032,7 @@
         <w:t xml:space="preserve"> </w:t>
       </w:r>
       <w:r>
-        <w:t xml:space="preserve">— enviadas pela equipe; se a pasta não estiver no repositório, ainda não</w:t>
-      </w:r>
-      <w:r>
-        <w:t xml:space="preserve"> </w:t>
-      </w:r>
-      <w:r>
-        <w:t xml:space="preserve">foram publicadas.</w:t>
+        <w:t xml:space="preserve">— enviadas pela equipe.</w:t>
       </w:r>
     </w:p>
     <w:bookmarkEnd w:id="112"/>
@@ -23134,10 +23143,13 @@
                 <w:bCs/>
                 <w:b/>
               </w:rPr>
-              <w:t xml:space="preserve">R$ 40,99 no carrinho</w:t>
-            </w:r>
-            <w:r>
-              <w:t xml:space="preserve">; o total do carrinho fica abaixo de subtotal + taxa sem desconto visível no</w:t>
+              <w:t xml:space="preserve">R$ 39,99 no carrinho</w:t>
+            </w:r>
+            <w:r>
+              <w:t xml:space="preserve"> </w:t>
+            </w:r>
+            <w:r>
+              <w:t xml:space="preserve">(subtotal da amostra); o total do carrinho fica abaixo de subtotal + taxa sem desconto visível no</w:t>
             </w:r>
             <w:r>
               <w:t xml:space="preserve"> </w:t>

</xml_diff>